<commit_message>
Update research paper to IEEE two-column format with Mermaid JS diagrams
Co-authored-by: Amogh-1416 <139241924+Amogh-1416@users.noreply.github.com>
</commit_message>
<xml_diff>
--- a/Vayu_Drishti_Research_Paper.docx
+++ b/Vayu_Drishti_Research_Paper.docx
@@ -15,89 +15,131 @@
       </w:r>
     </w:p>
     <w:p/>
-    <w:p>
-      <w:pPr>
+    <w:tbl>
+      <w:tblPr>
+        <w:tblW w:type="auto" w:w="0"/>
         <w:jc w:val="center"/>
-      </w:pPr>
-      <w:r>
-        <w:rPr>
-          <w:sz w:val="22"/>
-        </w:rPr>
-        <w:t>Author Name 1</w:t>
-        <w:br/>
-        <w:t>Department Name</w:t>
-        <w:br/>
-        <w:t>Institution Name</w:t>
-        <w:br/>
-        <w:t>City, Country</w:t>
-        <w:br/>
-        <w:t>email@domain.com</w:t>
-      </w:r>
-    </w:p>
-    <w:p/>
-    <w:p>
-      <w:pPr>
-        <w:jc w:val="center"/>
-      </w:pPr>
-      <w:r>
-        <w:rPr>
-          <w:sz w:val="22"/>
-        </w:rPr>
-        <w:t>Author Name 2</w:t>
-        <w:br/>
-        <w:t>Department Name</w:t>
-        <w:br/>
-        <w:t>Institution Name</w:t>
-        <w:br/>
-        <w:t>City, Country</w:t>
-        <w:br/>
-        <w:t>email@domain.com</w:t>
-      </w:r>
-    </w:p>
-    <w:p/>
-    <w:p>
-      <w:pPr>
-        <w:jc w:val="center"/>
-      </w:pPr>
-      <w:r>
-        <w:rPr>
-          <w:sz w:val="22"/>
-        </w:rPr>
-        <w:t>Author Name 3</w:t>
-        <w:br/>
-        <w:t>Department Name</w:t>
-        <w:br/>
-        <w:t>Institution Name</w:t>
-        <w:br/>
-        <w:t>City, Country</w:t>
-        <w:br/>
-        <w:t>email@domain.com</w:t>
-      </w:r>
-    </w:p>
-    <w:p/>
-    <w:p>
-      <w:pPr>
-        <w:jc w:val="center"/>
-      </w:pPr>
-      <w:r>
-        <w:rPr>
-          <w:sz w:val="22"/>
-        </w:rPr>
-        <w:t>Author Name 4</w:t>
-        <w:br/>
-        <w:t>Department Name</w:t>
-        <w:br/>
-        <w:t>Institution Name</w:t>
-        <w:br/>
-        <w:t>City, Country</w:t>
-        <w:br/>
-        <w:t>email@domain.com</w:t>
-      </w:r>
-    </w:p>
+        <w:tblLook w:firstColumn="1" w:firstRow="1" w:lastColumn="0" w:lastRow="0" w:noHBand="0" w:noVBand="1" w:val="04A0"/>
+      </w:tblPr>
+      <w:tblGrid>
+        <w:gridCol w:w="2340"/>
+        <w:gridCol w:w="2340"/>
+        <w:gridCol w:w="2340"/>
+        <w:gridCol w:w="2340"/>
+      </w:tblGrid>
+      <w:tr>
+        <w:tc>
+          <w:tcPr>
+            <w:tcW w:type="dxa" w:w="2340"/>
+          </w:tcPr>
+          <w:p>
+            <w:pPr>
+              <w:jc w:val="center"/>
+            </w:pPr>
+            <w:r>
+              <w:rPr>
+                <w:sz w:val="22"/>
+              </w:rPr>
+              <w:t>Author Name 1</w:t>
+              <w:br/>
+              <w:t>Department Name</w:t>
+              <w:br/>
+              <w:t>Institution Name</w:t>
+              <w:br/>
+              <w:t>City, Country</w:t>
+              <w:br/>
+              <w:t>email@domain.com</w:t>
+            </w:r>
+          </w:p>
+        </w:tc>
+        <w:tc>
+          <w:tcPr>
+            <w:tcW w:type="dxa" w:w="2340"/>
+          </w:tcPr>
+          <w:p>
+            <w:pPr>
+              <w:jc w:val="center"/>
+            </w:pPr>
+            <w:r>
+              <w:rPr>
+                <w:sz w:val="22"/>
+              </w:rPr>
+              <w:t>Author Name 2</w:t>
+              <w:br/>
+              <w:t>Department Name</w:t>
+              <w:br/>
+              <w:t>Institution Name</w:t>
+              <w:br/>
+              <w:t>City, Country</w:t>
+              <w:br/>
+              <w:t>email@domain.com</w:t>
+            </w:r>
+          </w:p>
+        </w:tc>
+        <w:tc>
+          <w:tcPr>
+            <w:tcW w:type="dxa" w:w="2340"/>
+          </w:tcPr>
+          <w:p>
+            <w:pPr>
+              <w:jc w:val="center"/>
+            </w:pPr>
+            <w:r>
+              <w:rPr>
+                <w:sz w:val="22"/>
+              </w:rPr>
+              <w:t>Author Name 3</w:t>
+              <w:br/>
+              <w:t>Department Name</w:t>
+              <w:br/>
+              <w:t>Institution Name</w:t>
+              <w:br/>
+              <w:t>City, Country</w:t>
+              <w:br/>
+              <w:t>email@domain.com</w:t>
+            </w:r>
+          </w:p>
+        </w:tc>
+        <w:tc>
+          <w:tcPr>
+            <w:tcW w:type="dxa" w:w="2340"/>
+          </w:tcPr>
+          <w:p>
+            <w:pPr>
+              <w:jc w:val="center"/>
+            </w:pPr>
+            <w:r>
+              <w:rPr>
+                <w:sz w:val="22"/>
+              </w:rPr>
+              <w:t>Author Name 4</w:t>
+              <w:br/>
+              <w:t>Department Name</w:t>
+              <w:br/>
+              <w:t>Institution Name</w:t>
+              <w:br/>
+              <w:t>City, Country</w:t>
+              <w:br/>
+              <w:t>email@domain.com</w:t>
+            </w:r>
+          </w:p>
+        </w:tc>
+      </w:tr>
+    </w:tbl>
     <w:p>
       <w:r>
         <w:br/>
       </w:r>
+    </w:p>
+    <w:p>
+      <w:pPr>
+        <w:sectPr>
+          <w:pgSz w:w="12240" w:h="15840"/>
+          <w:pgMar w:top="1440" w:right="1440" w:bottom="1440" w:left="1440" w:header="720" w:footer="720" w:gutter="0"/>
+          <w:cols w:space="708" w:num="1" w:equalWidth="1"/>
+          <w:docGrid w:linePitch="360"/>
+        </w:sectPr>
+      </w:pPr>
     </w:p>
     <w:p>
       <w:pPr>
@@ -371,7 +413,7 @@
       <w:r>
         <w:drawing>
           <wp:inline xmlns:a="http://schemas.openxmlformats.org/drawingml/2006/main" xmlns:pic="http://schemas.openxmlformats.org/drawingml/2006/picture">
-            <wp:extent cx="5486400" cy="2078340"/>
+            <wp:extent cx="2926080" cy="2565725"/>
             <wp:docPr id="1" name="Picture 1"/>
             <wp:cNvGraphicFramePr>
               <a:graphicFrameLocks noChangeAspect="1"/>
@@ -380,7 +422,7 @@
               <a:graphicData uri="http://schemas.openxmlformats.org/drawingml/2006/picture">
                 <pic:pic>
                   <pic:nvPicPr>
-                    <pic:cNvPr id="0" name="system_architecture.png"/>
+                    <pic:cNvPr id="0" name="arch.png"/>
                     <pic:cNvPicPr/>
                   </pic:nvPicPr>
                   <pic:blipFill>
@@ -392,7 +434,7 @@
                   <pic:spPr>
                     <a:xfrm>
                       <a:off x="0" y="0"/>
-                      <a:ext cx="5486400" cy="2078340"/>
+                      <a:ext cx="2926080" cy="2565725"/>
                     </a:xfrm>
                     <a:prstGeom prst="rect"/>
                   </pic:spPr>
@@ -412,7 +454,7 @@
           <w:i/>
           <w:sz w:val="18"/>
         </w:rPr>
-        <w:t>Fig. 1: System Architecture of Vayu Drishti</w:t>
+        <w:t>Fig. 1: Overall System Architecture of Vayu Drishti</w:t>
       </w:r>
     </w:p>
     <w:p>
@@ -427,7 +469,7 @@
           <w:color w:val="000000"/>
           <w:sz w:val="20"/>
         </w:rPr>
-        <w:t>A. UAV Data Ingestion</w:t>
+        <w:t>A. UAV Data Ingestion &amp; Real-Time Comms</w:t>
       </w:r>
     </w:p>
     <w:p>
@@ -436,6 +478,57 @@
       </w:pPr>
       <w:r>
         <w:t>UAVs continuously stream real-time telemetry (GPS, altitude, orientation) and video feeds via WebSockets to our Django-based backend. Redis channel layers manage the high-throughput pub/sub mechanism, ensuring that latency is minimized between data capture and processing.</w:t>
+      </w:r>
+    </w:p>
+    <w:p>
+      <w:pPr>
+        <w:jc w:val="center"/>
+      </w:pPr>
+      <w:r>
+        <w:drawing>
+          <wp:inline xmlns:a="http://schemas.openxmlformats.org/drawingml/2006/main" xmlns:pic="http://schemas.openxmlformats.org/drawingml/2006/picture">
+            <wp:extent cx="2926080" cy="1188906"/>
+            <wp:docPr id="2" name="Picture 2"/>
+            <wp:cNvGraphicFramePr>
+              <a:graphicFrameLocks noChangeAspect="1"/>
+            </wp:cNvGraphicFramePr>
+            <a:graphic>
+              <a:graphicData uri="http://schemas.openxmlformats.org/drawingml/2006/picture">
+                <pic:pic>
+                  <pic:nvPicPr>
+                    <pic:cNvPr id="0" name="ws_flow.png"/>
+                    <pic:cNvPicPr/>
+                  </pic:nvPicPr>
+                  <pic:blipFill>
+                    <a:blip r:embed="rId10"/>
+                    <a:stretch>
+                      <a:fillRect/>
+                    </a:stretch>
+                  </pic:blipFill>
+                  <pic:spPr>
+                    <a:xfrm>
+                      <a:off x="0" y="0"/>
+                      <a:ext cx="2926080" cy="1188906"/>
+                    </a:xfrm>
+                    <a:prstGeom prst="rect"/>
+                  </pic:spPr>
+                </pic:pic>
+              </a:graphicData>
+            </a:graphic>
+          </wp:inline>
+        </w:drawing>
+      </w:r>
+    </w:p>
+    <w:p>
+      <w:pPr>
+        <w:jc w:val="center"/>
+      </w:pPr>
+      <w:r>
+        <w:rPr>
+          <w:i/>
+          <w:sz w:val="18"/>
+        </w:rPr>
+        <w:t>Fig. 2: WebSocket Data Communication Flow</w:t>
       </w:r>
     </w:p>
     <w:p>
@@ -468,8 +561,8 @@
       <w:r>
         <w:drawing>
           <wp:inline xmlns:a="http://schemas.openxmlformats.org/drawingml/2006/main" xmlns:pic="http://schemas.openxmlformats.org/drawingml/2006/picture">
-            <wp:extent cx="3200400" cy="2133600"/>
-            <wp:docPr id="2" name="Picture 2"/>
+            <wp:extent cx="2926080" cy="400359"/>
+            <wp:docPr id="3" name="Picture 3"/>
             <wp:cNvGraphicFramePr>
               <a:graphicFrameLocks noChangeAspect="1"/>
             </wp:cNvGraphicFramePr>
@@ -477,11 +570,11 @@
               <a:graphicData uri="http://schemas.openxmlformats.org/drawingml/2006/picture">
                 <pic:pic>
                   <pic:nvPicPr>
-                    <pic:cNvPr id="0" name="yolo_loss.png"/>
+                    <pic:cNvPr id="0" name="ml_pipe.png"/>
                     <pic:cNvPicPr/>
                   </pic:nvPicPr>
                   <pic:blipFill>
-                    <a:blip r:embed="rId10"/>
+                    <a:blip r:embed="rId11"/>
                     <a:stretch>
                       <a:fillRect/>
                     </a:stretch>
@@ -489,7 +582,7 @@
                   <pic:spPr>
                     <a:xfrm>
                       <a:off x="0" y="0"/>
-                      <a:ext cx="3200400" cy="2133600"/>
+                      <a:ext cx="2926080" cy="400359"/>
                     </a:xfrm>
                     <a:prstGeom prst="rect"/>
                   </pic:spPr>
@@ -509,7 +602,7 @@
           <w:i/>
           <w:sz w:val="18"/>
         </w:rPr>
-        <w:t>Fig. 2: Stage 1 Alignment Training (Detection Loss)</w:t>
+        <w:t>Fig. 3: Multi-Model Inference Pipeline</w:t>
       </w:r>
     </w:p>
     <w:p>
@@ -519,8 +612,8 @@
       <w:r>
         <w:drawing>
           <wp:inline xmlns:a="http://schemas.openxmlformats.org/drawingml/2006/main" xmlns:pic="http://schemas.openxmlformats.org/drawingml/2006/picture">
-            <wp:extent cx="3200400" cy="2133600"/>
-            <wp:docPr id="3" name="Picture 3"/>
+            <wp:extent cx="2926080" cy="1950720"/>
+            <wp:docPr id="4" name="Picture 4"/>
             <wp:cNvGraphicFramePr>
               <a:graphicFrameLocks noChangeAspect="1"/>
             </wp:cNvGraphicFramePr>
@@ -528,11 +621,11 @@
               <a:graphicData uri="http://schemas.openxmlformats.org/drawingml/2006/picture">
                 <pic:pic>
                   <pic:nvPicPr>
-                    <pic:cNvPr id="0" name="rescuenet_acc.png"/>
+                    <pic:cNvPr id="0" name="yolo_loss.png"/>
                     <pic:cNvPicPr/>
                   </pic:nvPicPr>
                   <pic:blipFill>
-                    <a:blip r:embed="rId11"/>
+                    <a:blip r:embed="rId12"/>
                     <a:stretch>
                       <a:fillRect/>
                     </a:stretch>
@@ -540,7 +633,7 @@
                   <pic:spPr>
                     <a:xfrm>
                       <a:off x="0" y="0"/>
-                      <a:ext cx="3200400" cy="2133600"/>
+                      <a:ext cx="2926080" cy="1950720"/>
                     </a:xfrm>
                     <a:prstGeom prst="rect"/>
                   </pic:spPr>
@@ -560,7 +653,58 @@
           <w:i/>
           <w:sz w:val="18"/>
         </w:rPr>
-        <w:t>Fig. 3: Stage 2 RescueNet Fine-Tuning Accuracy</w:t>
+        <w:t>Fig. 4: Stage 1 Alignment Training (Detection Loss)</w:t>
+      </w:r>
+    </w:p>
+    <w:p>
+      <w:pPr>
+        <w:jc w:val="center"/>
+      </w:pPr>
+      <w:r>
+        <w:drawing>
+          <wp:inline xmlns:a="http://schemas.openxmlformats.org/drawingml/2006/main" xmlns:pic="http://schemas.openxmlformats.org/drawingml/2006/picture">
+            <wp:extent cx="2926080" cy="1950720"/>
+            <wp:docPr id="5" name="Picture 5"/>
+            <wp:cNvGraphicFramePr>
+              <a:graphicFrameLocks noChangeAspect="1"/>
+            </wp:cNvGraphicFramePr>
+            <a:graphic>
+              <a:graphicData uri="http://schemas.openxmlformats.org/drawingml/2006/picture">
+                <pic:pic>
+                  <pic:nvPicPr>
+                    <pic:cNvPr id="0" name="rescuenet_acc.png"/>
+                    <pic:cNvPicPr/>
+                  </pic:nvPicPr>
+                  <pic:blipFill>
+                    <a:blip r:embed="rId13"/>
+                    <a:stretch>
+                      <a:fillRect/>
+                    </a:stretch>
+                  </pic:blipFill>
+                  <pic:spPr>
+                    <a:xfrm>
+                      <a:off x="0" y="0"/>
+                      <a:ext cx="2926080" cy="1950720"/>
+                    </a:xfrm>
+                    <a:prstGeom prst="rect"/>
+                  </pic:spPr>
+                </pic:pic>
+              </a:graphicData>
+            </a:graphic>
+          </wp:inline>
+        </w:drawing>
+      </w:r>
+    </w:p>
+    <w:p>
+      <w:pPr>
+        <w:jc w:val="center"/>
+      </w:pPr>
+      <w:r>
+        <w:rPr>
+          <w:i/>
+          <w:sz w:val="18"/>
+        </w:rPr>
+        <w:t>Fig. 5: Stage 2 RescueNet Fine-Tuning Accuracy</w:t>
       </w:r>
     </w:p>
     <w:p>
@@ -703,9 +847,10 @@
       </w:r>
     </w:p>
     <w:sectPr>
+      <w:type w:val="continuous"/>
       <w:pgSz w:w="12240" w:h="15840"/>
       <w:pgMar w:top="1440" w:right="1440" w:bottom="1440" w:left="1440" w:header="720" w:footer="720" w:gutter="0"/>
-      <w:cols w:space="720"/>
+      <w:cols w:space="708" w:num="2" w:equalWidth="1"/>
       <w:docGrid w:linePitch="360"/>
     </w:sectPr>
   </w:body>

</xml_diff>